<commit_message>
Complete section 5.7 to 5.10: S3, SQS worker, Amplify & Route 53, and Resource Cleanup
</commit_message>
<xml_diff>
--- a/static/images/5-Workshop/5.6-API-Gateway/APIGateway.docx
+++ b/static/images/5-Workshop/5.6-API-Gateway/APIGateway.docx
@@ -593,8 +593,13 @@
         <w:jc w:val="center"/>
       </w:pPr>
       <w:r>
-        <w:t>https://&lt;api-id&gt;.execute-api.ap-southeast-1.amazonaws.com</w:t>
-      </w:r>
+        <w:t>https://&lt;api-id</w:t>
+      </w:r>
+      <w:proofErr w:type="gramStart"/>
+      <w:r>
+        <w:t>&gt;.execute-api.ap-southeast-1.amazonaws.com</w:t>
+      </w:r>
+      <w:proofErr w:type="gramEnd"/>
     </w:p>
     <w:p>
       <w:pPr>
@@ -1160,7 +1165,15 @@
           <w:b/>
           <w:bCs/>
         </w:rPr>
-        <w:t>GET /health</w:t>
+        <w:t>GET /</w:t>
+      </w:r>
+      <w:proofErr w:type="gramStart"/>
+      <w:r>
+        <w:rPr>
+          <w:b/>
+          <w:bCs/>
+        </w:rPr>
+        <w:t>health</w:t>
       </w:r>
       <w:r>
         <w:t xml:space="preserve"> </w:t>
@@ -1173,6 +1186,7 @@
         <w:t>được</w:t>
       </w:r>
       <w:proofErr w:type="spellEnd"/>
+      <w:proofErr w:type="gramEnd"/>
       <w:r>
         <w:t xml:space="preserve"> </w:t>
       </w:r>
@@ -1353,7 +1367,11 @@
       </w:r>
       <w:proofErr w:type="spellEnd"/>
       <w:r>
-        <w:t>/auth/me</w:t>
+        <w:t>/auth/</w:t>
+      </w:r>
+      <w:proofErr w:type="gramStart"/>
+      <w:r>
+        <w:t>me</w:t>
       </w:r>
       <w:r>
         <w:t xml:space="preserve">,  </w:t>
@@ -1362,15 +1380,24 @@
         <w:t>/</w:t>
       </w:r>
       <w:proofErr w:type="spellStart"/>
+      <w:proofErr w:type="gramEnd"/>
       <w:r>
         <w:t>api</w:t>
       </w:r>
       <w:proofErr w:type="spellEnd"/>
       <w:r>
-        <w:t>/lop-hoc</w:t>
-      </w:r>
-      <w:r>
-        <w:t xml:space="preserve"> , </w:t>
+        <w:t>/lop-</w:t>
+      </w:r>
+      <w:proofErr w:type="gramStart"/>
+      <w:r>
+        <w:t>hoc</w:t>
+      </w:r>
+      <w:r>
+        <w:t xml:space="preserve"> ,</w:t>
+      </w:r>
+      <w:proofErr w:type="gramEnd"/>
+      <w:r>
+        <w:t xml:space="preserve"> </w:t>
       </w:r>
       <w:r>
         <w:t>/</w:t>
@@ -2305,7 +2332,15 @@
       </w:r>
       <w:proofErr w:type="spellEnd"/>
       <w:r>
-        <w:t xml:space="preserve"> token do Amazon Cognito </w:t>
+        <w:t xml:space="preserve"> token </w:t>
+      </w:r>
+      <w:proofErr w:type="gramStart"/>
+      <w:r>
+        <w:t>do</w:t>
+      </w:r>
+      <w:proofErr w:type="gramEnd"/>
+      <w:r>
+        <w:t xml:space="preserve"> Amazon Cognito </w:t>
       </w:r>
       <w:proofErr w:type="spellStart"/>
       <w:r>
@@ -2698,8 +2733,13 @@
         <w:t>$</w:t>
       </w:r>
       <w:proofErr w:type="spellStart"/>
-      <w:r>
-        <w:t>request.header.Authorization</w:t>
+      <w:proofErr w:type="gramStart"/>
+      <w:r>
+        <w:t>request.header</w:t>
+      </w:r>
+      <w:proofErr w:type="gramEnd"/>
+      <w:r>
+        <w:t>.Authorization</w:t>
       </w:r>
       <w:proofErr w:type="spellEnd"/>
     </w:p>
@@ -2806,9 +2846,9 @@
           <w:noProof/>
         </w:rPr>
         <w:drawing>
-          <wp:inline distT="0" distB="0" distL="0" distR="0" wp14:anchorId="5C054A2A" wp14:editId="4F4346C2">
-            <wp:extent cx="5940425" cy="1489710"/>
-            <wp:effectExtent l="0" t="0" r="3175" b="0"/>
+          <wp:inline distT="0" distB="0" distL="0" distR="0" wp14:anchorId="5C054A2A" wp14:editId="02BAA23C">
+            <wp:extent cx="5682343" cy="1489710"/>
+            <wp:effectExtent l="0" t="0" r="0" b="0"/>
             <wp:docPr id="232666331" name="Picture 1"/>
             <wp:cNvGraphicFramePr>
               <a:graphicFrameLocks xmlns:a="http://schemas.openxmlformats.org/drawingml/2006/main" noChangeAspect="1"/>
@@ -2829,7 +2869,7 @@
                   <pic:spPr>
                     <a:xfrm>
                       <a:off x="0" y="0"/>
-                      <a:ext cx="5940425" cy="1489710"/>
+                      <a:ext cx="5686724" cy="1490859"/>
                     </a:xfrm>
                     <a:prstGeom prst="rect">
                       <a:avLst/>
@@ -4369,8 +4409,13 @@
         <w:pStyle w:val="ListParagraph"/>
         <w:ind w:left="2880"/>
       </w:pPr>
-      <w:r>
-        <w:t>fetch("https://4js2c8rp18.execute-api.ap-southeast-1.amazonaws.com/api/auth/me", {</w:t>
+      <w:proofErr w:type="gramStart"/>
+      <w:r>
+        <w:t>fetch(</w:t>
+      </w:r>
+      <w:proofErr w:type="gramEnd"/>
+      <w:r>
+        <w:t>"https://4js2c8rp18.execute-api.ap-southeast-1.amazonaws.com/api/auth/me", {</w:t>
       </w:r>
     </w:p>
     <w:p>
@@ -4396,8 +4441,13 @@
       </w:r>
       <w:proofErr w:type="spellEnd"/>
       <w:r>
-        <w:t>("token")}`</w:t>
-      </w:r>
+        <w:t>("token"</w:t>
+      </w:r>
+      <w:proofErr w:type="gramStart"/>
+      <w:r>
+        <w:t>)}`</w:t>
+      </w:r>
+      <w:proofErr w:type="gramEnd"/>
     </w:p>
     <w:p>
       <w:pPr>
@@ -4423,7 +4473,15 @@
         <w:ind w:left="2880"/>
       </w:pPr>
       <w:r>
-        <w:t xml:space="preserve">  .then(async res =&gt; {</w:t>
+        <w:t xml:space="preserve">  </w:t>
+      </w:r>
+      <w:proofErr w:type="gramStart"/>
+      <w:r>
+        <w:t>.then</w:t>
+      </w:r>
+      <w:proofErr w:type="gramEnd"/>
+      <w:r>
+        <w:t>(async res =&gt; {</w:t>
       </w:r>
     </w:p>
     <w:p>
@@ -4432,13 +4490,23 @@
         <w:ind w:left="2880"/>
       </w:pPr>
       <w:r>
-        <w:t xml:space="preserve">    console.log("status", </w:t>
-      </w:r>
-      <w:proofErr w:type="spellStart"/>
+        <w:t xml:space="preserve">    </w:t>
+      </w:r>
+      <w:proofErr w:type="gramStart"/>
+      <w:r>
+        <w:t>console.log(</w:t>
+      </w:r>
+      <w:proofErr w:type="gramEnd"/>
+      <w:r>
+        <w:t xml:space="preserve">"status", </w:t>
+      </w:r>
+      <w:proofErr w:type="spellStart"/>
+      <w:proofErr w:type="gramStart"/>
       <w:r>
         <w:t>res.status</w:t>
       </w:r>
       <w:proofErr w:type="spellEnd"/>
+      <w:proofErr w:type="gramEnd"/>
       <w:r>
         <w:t>);</w:t>
       </w:r>
@@ -4449,15 +4517,31 @@
         <w:ind w:left="2880"/>
       </w:pPr>
       <w:r>
-        <w:t xml:space="preserve">    console.log(await </w:t>
-      </w:r>
-      <w:proofErr w:type="spellStart"/>
-      <w:r>
-        <w:t>res.text</w:t>
-      </w:r>
-      <w:proofErr w:type="spellEnd"/>
-      <w:r>
-        <w:t>());</w:t>
+        <w:t xml:space="preserve">    </w:t>
+      </w:r>
+      <w:proofErr w:type="gramStart"/>
+      <w:r>
+        <w:t>console.log(</w:t>
+      </w:r>
+      <w:proofErr w:type="gramEnd"/>
+      <w:r>
+        <w:t xml:space="preserve">await </w:t>
+      </w:r>
+      <w:proofErr w:type="spellStart"/>
+      <w:r>
+        <w:t>res.</w:t>
+      </w:r>
+      <w:proofErr w:type="gramStart"/>
+      <w:r>
+        <w:t>text</w:t>
+      </w:r>
+      <w:proofErr w:type="spellEnd"/>
+      <w:r>
+        <w:t>(</w:t>
+      </w:r>
+      <w:proofErr w:type="gramEnd"/>
+      <w:r>
+        <w:t>));</w:t>
       </w:r>
     </w:p>
     <w:p>
@@ -4475,13 +4559,23 @@
         <w:ind w:left="2880"/>
       </w:pPr>
       <w:r>
-        <w:t xml:space="preserve"> .catch(</w:t>
-      </w:r>
-      <w:proofErr w:type="spellStart"/>
+        <w:t xml:space="preserve"> </w:t>
+      </w:r>
+      <w:proofErr w:type="gramStart"/>
+      <w:r>
+        <w:t>.catch</w:t>
+      </w:r>
+      <w:proofErr w:type="gramEnd"/>
+      <w:r>
+        <w:t>(</w:t>
+      </w:r>
+      <w:proofErr w:type="spellStart"/>
+      <w:proofErr w:type="gramStart"/>
       <w:r>
         <w:t>console.error</w:t>
       </w:r>
       <w:proofErr w:type="spellEnd"/>
+      <w:proofErr w:type="gramEnd"/>
       <w:r>
         <w:t>);</w:t>
       </w:r>
@@ -4671,6 +4765,9 @@
         <w:ind w:left="993"/>
       </w:pPr>
       <w:r>
+        <w:rPr>
+          <w:noProof/>
+        </w:rPr>
         <w:drawing>
           <wp:inline distT="0" distB="0" distL="0" distR="0" wp14:anchorId="4BA06C70" wp14:editId="4E282E5D">
             <wp:extent cx="4190289" cy="3924300"/>
@@ -8307,6 +8404,7 @@
   <w:style w:type="character" w:default="1" w:styleId="DefaultParagraphFont">
     <w:name w:val="Default Paragraph Font"/>
     <w:uiPriority w:val="1"/>
+    <w:semiHidden/>
     <w:unhideWhenUsed/>
   </w:style>
   <w:style w:type="table" w:default="1" w:styleId="TableNormal">

</xml_diff>